<commit_message>
Actualiza informe final del taller de algebra lineal
</commit_message>
<xml_diff>
--- a/Informe/Informe_Taller_Algebra_Lineal_Numerica_Jimmy_Sebastian.docx
+++ b/Informe/Informe_Taller_Algebra_Lineal_Numerica_Jimmy_Sebastian.docx
@@ -76,10 +76,7 @@
         <w:jc w:val="center"/>
       </w:pPr>
       <w:r>
-        <w:rPr>
-          <w:i/>
-        </w:rPr>
-        <w:t>Nota: el Punto 2 se deja pendiente, ya que el enunciado suministra la matriz A de 10×10 pero no especifica el vector independiente b necesario para obtener una solución única del sistema.</w:t>
+        <w:t>Nota: como el enunciado del Punto 2 suministra la matriz A de 10×10 pero no especifica el vector independiente b, para completar la comparación numérica se asumió explícitamente b = [1,2,3,4,5,6,7,8,9,10]ᵀ.</w:t>
       </w:r>
     </w:p>
     <w:p>
@@ -183,7 +180,7 @@
     </w:p>
     <w:p>
       <w:r>
-        <w:t>Las cuatro condiciones se verificaron numéricamente en Octave y en Eigen3. Las diferencias observadas fueron del orden del error de redondeo de punto flotante (aproximadamente 10⁻¹⁶), por lo que pueden considerarse cero numérico. Ambos entornos produjeron la misma pseudoinversa dentro de la precisión disponible.</w:t>
+        <w:t>Las cuatro condiciones se verificaron numéricamente en Octave y en Eigen3. Los errores obtenidos estuvieron aproximadamente entre 10⁻¹⁵ y 10⁻¹⁶, magnitudes compatibles con el redondeo de punto flotante, por lo que puede considerarse que las cuatro propiedades de Moore-Penrose se satisfacen numéricamente.</w:t>
       </w:r>
     </w:p>
     <w:p>
@@ -391,7 +388,7 @@
           </w:tcPr>
           <w:p>
             <w:r>
-              <w:t>5.9241 × 10⁻¹²</w:t>
+              <w:t>6.19865 × 10⁻¹²</w:t>
             </w:r>
           </w:p>
         </w:tc>
@@ -423,7 +420,7 @@
           </w:tcPr>
           <w:p>
             <w:r>
-              <w:t>2.7371 × 10⁻¹¹</w:t>
+              <w:t>2.74385 × 10⁻¹¹</w:t>
             </w:r>
           </w:p>
         </w:tc>
@@ -455,7 +452,7 @@
           </w:tcPr>
           <w:p>
             <w:r>
-              <w:t>3.2090 × 10⁻¹¹</w:t>
+              <w:t>3.21896 × 10⁻¹¹</w:t>
             </w:r>
           </w:p>
         </w:tc>
@@ -927,7 +924,7 @@
     </w:tbl>
     <w:p>
       <w:r>
-        <w:t>El número de condición de X es aproximadamente 347.22. Esto evidencia sensibilidad numérica apreciable, aunque muy inferior a la observada en la matriz de Hilbert del Punto 3. Los resultados de Octave y Eigen3 coinciden dentro del redondeo mostrado.</w:t>
+        <w:t>Se calculó explícitamente el vector residual r = y - Xβ̂ para las 100 observaciones. Como indicadores resumidos se obtuvo ||r||₂ = 155.040807, un error cuadrático medio MSE = 240.376517 y un residuo absoluto máximo de 47.957115. El número de condición de X es aproximadamente 347.22. Esto evidencia una sensibilidad numérica apreciable, aunque muy inferior a la observada en la matriz de Hilbert del Punto 3. Los resultados de Octave y Eigen3 coinciden dentro de la precisión numérica.</w:t>
       </w:r>
     </w:p>
     <w:p>
@@ -1170,17 +1167,21 @@
         <w:pStyle w:val="Heading1"/>
       </w:pPr>
       <w:r>
-        <w:t>6. Punto 2 – Estado pendiente</w:t>
+        <w:t>6. Punto 2 – Sistema lineal 10×10: Gauss, LU y QR</w:t>
       </w:r>
     </w:p>
     <w:p>
       <w:r>
-        <w:t>El enunciado proporciona una matriz A de 10×10 y solicita resolver el sistema mediante eliminación de Gauss, factorización LU y factorización QR, comparando estabilidad y eficiencia. Sin embargo, no suministra el vector independiente b. Por esta razón no se presenta una solución x inventando datos que no aparecen en el enunciado.</w:t>
+        <w:t>El enunciado proporciona la matriz de coeficientes A de dimensión 10×10 pero no especifica el vector independiente b. Para completar el ejercicio y poder comparar los métodos, se asumió b = [1,2,3,4,5,6,7,8,9,10]ᵀ. Esta elección se realizó únicamente con fines de análisis numérico y se declara de forma explícita para no atribuirla al enunciado original.</w:t>
       </w:r>
     </w:p>
     <w:p>
       <w:r>
-        <w:t>Como avance, la implementación preparada obtuvo errores de reconstrucción de aproximadamente 2.07704×10⁻¹⁵ para LU y 7.52197×10⁻¹⁵ para QR, y un número de condición de A de aproximadamente 51.715. La solución definitiva queda pendiente de la definición de b por parte del profesor.</w:t>
+        <w:t>El sistema se resolvió mediante eliminación gaussiana con pivoteo parcial, factorización LU y factorización QR. Los tres métodos produjeron, dentro de la precisión numérica, la misma solución:</w:t>
+        <w:br/>
+        <w:t>x ≈ [-0.5402100241, -4.1975720146, -2.1442633550, -4.0005796843, 3.1458128957, 1.3559261571, 3.5632413270, -2.4104833675, 3.1812739677, 3.0679679836]ᵀ.</w:t>
+        <w:br/>
+        <w:t>En C++/Eigen3 los residuos fueron 8.57×10⁻¹⁵ (Gauss), 1.29×10⁻¹⁴ (LU) y 2.12×10⁻¹⁴ (QR). En Octave fueron 6.40×10⁻¹⁵ (A\b), 6.40×10⁻¹⁵ (LU) y 1.56×10⁻¹⁴ (QR). El número de condición fue κ(A) ≈ 51.715, lo que indica un condicionamiento moderado. Las diferencias entre soluciones fueron nulas o del orden de 10⁻¹⁵. Para una matriz tan pequeña, los tiempos de una sola ejecución no deben interpretarse como una comparación universal de rendimiento; LU resulta especialmente útil cuando se reutiliza la misma matriz con varios vectores b, mientras que QR ofrece buenas propiedades de estabilidad numérica.</w:t>
       </w:r>
     </w:p>
     <w:p>
@@ -1196,6 +1197,7 @@
         <w:t>La pseudoinversa de Moore-Penrose fue reproducida consistentemente en Octave y Eigen3 y satisfizo sus cuatro propiedades dentro de la precisión de punto flotante.</w:t>
       </w:r>
     </w:p>
+    <CT_P/>
     <w:p>
       <w:r>
         <w:t>La matriz de Hilbert evidenció el efecto del mal condicionamiento: una perturbación de 10⁻⁵ en b produjo un error relativo cercano al 0.84 % en la solución.</w:t>
@@ -1217,6 +1219,12 @@
       </w:r>
     </w:p>
     <w:p>
+      <w:pPr/>
+      <w:r>
+        <w:t>Para el sistema 10×10, Gauss, LU y QR produjeron soluciones prácticamente idénticas y residuos del orden de 10⁻¹⁴–10⁻¹⁵. El número de condición κ(A) ≈ 51.715 indica un condicionamiento moderado.</w:t>
+      </w:r>
+    </w:p>
+    <w:p>
       <w:pPr>
         <w:pStyle w:val="Heading1"/>
       </w:pPr>
@@ -1226,7 +1234,7 @@
     </w:p>
     <w:p>
       <w:r>
-        <w:t>Para la entrega se recomienda adjuntar este informe junto con el repositorio/branch que contiene los códigos C++/Eigen3, el archivo CMakeLists.txt y el archivo CSV de 100 muestras. El Punto 2 debe completarse cuando se disponga del vector b.</w:t>
+        <w:t>Para la entrega se recomienda adjuntar este informe junto con el repositorio/branch que contiene los códigos C++/Eigen3, los scripts de Octave, el archivo CMakeLists.txt y el archivo CSV de 100 muestras. Los cinco puntos quedan desarrollados; en el Punto 2 se declara explícitamente que el vector b fue asumido por los autores para completar la comparación.</w:t>
       </w:r>
     </w:p>
     <w:tbl>
@@ -1322,7 +1330,7 @@
           </w:tcPr>
           <w:p>
             <w:r>
-              <w:t>Pendiente de b</w:t>
+              <w:t>Completo</w:t>
             </w:r>
           </w:p>
         </w:tc>
@@ -1332,7 +1340,7 @@
           </w:tcPr>
           <w:p>
             <w:r>
-              <w:t>punto2_sistema_10x10.cpp (avance)</w:t>
+              <w:t>punto2_sistema_10x10.cpp + Octave/punto2_sistema_10x10.m</w:t>
             </w:r>
           </w:p>
         </w:tc>
@@ -1428,7 +1436,7 @@
           </w:tcPr>
           <w:p>
             <w:r>
-              <w:t>punto5_minimos_cuadrados.cpp + datos_convertidor_realista.csv</w:t>
+              <w:t>punto5_minimos_cuadrados.cpp + datos_convertidor_realista.csv + script Octave</w:t>
             </w:r>
           </w:p>
         </w:tc>

</xml_diff>

<commit_message>
Actualiza informe final con integrantes y resultados definitivos
</commit_message>
<xml_diff>
--- a/Informe/Informe_Taller_Algebra_Lineal_Numerica_Jimmy_Sebastian.docx
+++ b/Informe/Informe_Taller_Algebra_Lineal_Numerica_Jimmy_Sebastian.docx
@@ -9,10 +9,8 @@
       <w:r>
         <w:rPr>
           <w:b/>
-          <w:sz w:val="40"/>
+          <w:sz w:val="32"/>
         </w:rPr>
-        <w:br/>
-        <w:br/>
         <w:t>TALLER SOBRE ÁLGEBRA LINEAL NUMÉRICA</w:t>
       </w:r>
     </w:p>
@@ -23,14 +21,9 @@
       <w:r>
         <w:rPr>
           <w:b/>
-          <w:sz w:val="28"/>
+          <w:sz w:val="26"/>
         </w:rPr>
-        <w:t>Métodos Computacionales en Ingeniería – MCEI</w:t>
-      </w:r>
-    </w:p>
-    <w:p>
-      <w:r>
-        <w:br/>
+        <w:t>Métodos computacionales en ingeniería – MCEI</w:t>
       </w:r>
     </w:p>
     <w:p>
@@ -38,37 +31,10 @@
         <w:jc w:val="center"/>
       </w:pPr>
       <w:r>
-        <w:t>Universidad Escuela Colombiana de Ingeniería Julio Garavito</w:t>
-        <w:br/>
-      </w:r>
-      <w:r>
-        <w:t>Profesor: Ing. Alexander Pérez Ruiz, PhD.</w:t>
-        <w:br/>
-        <w:br/>
-      </w:r>
-      <w:r>
         <w:rPr>
           <w:b/>
         </w:rPr>
-        <w:t>Estudiantes:</w:t>
-        <w:br/>
-      </w:r>
-      <w:r>
-        <w:t>Jimmy Alexander Calderón Trujillo</w:t>
-        <w:br/>
-      </w:r>
-      <w:r>
-        <w:t>Sebastián [completar apellido]</w:t>
-        <w:br/>
-        <w:br/>
-      </w:r>
-      <w:r>
-        <w:t>Septiembre de 2026</w:t>
-      </w:r>
-    </w:p>
-    <w:p>
-      <w:r>
-        <w:br/>
+        <w:t>Integrantes:</w:t>
       </w:r>
     </w:p>
     <w:p>
@@ -76,12 +42,28 @@
         <w:jc w:val="center"/>
       </w:pPr>
       <w:r>
-        <w:t>Nota: como el enunciado del Punto 2 suministra la matriz A de 10×10 pero no especifica el vector independiente b, para completar la comparación numérica se asumió explícitamente b = [1,2,3,4,5,6,7,8,9,10]ᵀ.</w:t>
+        <w:t>Jimmy Alexander Calderón Trujillo</w:t>
+      </w:r>
+    </w:p>
+    <w:p>
+      <w:pPr>
+        <w:jc w:val="center"/>
+      </w:pPr>
+      <w:r>
+        <w:t>Sebastian Barahona</w:t>
+      </w:r>
+    </w:p>
+    <w:p>
+      <w:pPr>
+        <w:jc w:val="center"/>
+      </w:pPr>
+      <w:r>
+        <w:t>Escuela Colombiana de Ingeniería Julio Garavito</w:t>
       </w:r>
     </w:p>
     <w:p>
       <w:r>
-        <w:br w:type="page"/>
+        <w:t>Nota metodológica: en el Punto 2 el enunciado suministra la matriz A de 10×10, pero no especifica el vector independiente b. Para completar la comparación numérica se asumió explícitamente b = [1,2,3,4,5,6,7,8,9,10]ᵀ.</w:t>
       </w:r>
     </w:p>
     <w:p>
@@ -89,17 +71,22 @@
         <w:pStyle w:val="Heading1"/>
       </w:pPr>
       <w:r>
-        <w:t>1. Objetivo y metodología</w:t>
+        <w:t>1. Punto 1 – Pseudoinversa de Moore-Penrose</w:t>
       </w:r>
     </w:p>
     <w:p>
       <w:r>
-        <w:t>El taller evalúa técnicas de álgebra lineal numérica mediante una implementación en GNU Octave y una implementación equivalente en C/C++ con la biblioteca Eigen3. En este informe se presentan los resultados de los puntos 1, 3, 4 y 5. El Punto 2 se mantiene pendiente hasta disponer del vector b.</w:t>
+        <w:t>Para la matriz A = [[1,0,2],[2,-1,5],[0,1,-1],[1,3,-1]], se calculó la pseudoinversa en GNU Octave mediante pinv(A) y en C++/Eigen3 mediante descomposición SVD.</w:t>
       </w:r>
     </w:p>
     <w:p>
       <w:r>
-        <w:t>Las comparaciones se realizaron a partir de residuos, errores de reconstrucción, números de condición y consistencia entre las soluciones obtenidas en ambos entornos.</w:t>
+        <w:t>A⁺ ≈ [[0.0512821, 0.0769231, 0.0256410, 0.1282051], [0.0435897, 0.0153846, 0.0717949, 0.2589744], [0.0589744, 0.1384615, -0.0205128, -0.0025641]].</w:t>
+      </w:r>
+    </w:p>
+    <w:p>
+      <w:r>
+        <w:t>Se verificaron las cuatro propiedades de Moore-Penrose. En Octave los errores fueron 2.50×10⁻¹⁵, 2.15×10⁻¹⁶, 3.91×10⁻¹⁶ y 3.70×10⁻¹⁶, respectivamente. Estos valores son compatibles con el redondeo de punto flotante.</w:t>
       </w:r>
     </w:p>
     <w:p>
@@ -107,224 +94,19 @@
         <w:pStyle w:val="Heading1"/>
       </w:pPr>
       <w:r>
-        <w:t>2. Punto 1 – Pseudoinversa de Moore-Penrose</w:t>
+        <w:t>2. Punto 2 – Sistema lineal 10×10: Gauss, LU y QR</w:t>
       </w:r>
     </w:p>
     <w:p>
       <w:r>
-        <w:t>Se analizó la matriz:</w:t>
-      </w:r>
-    </w:p>
-    <w:p>
-      <w:pPr>
-        <w:pStyle w:val="Código"/>
-      </w:pPr>
-      <w:r>
-        <w:t>A = [1  0  2;</w:t>
-        <w:br/>
-        <w:t xml:space="preserve">     2 -1  5;</w:t>
-        <w:br/>
-        <w:t xml:space="preserve">     0  1 -1;</w:t>
-        <w:br/>
-        <w:t xml:space="preserve">     1  3 -1]</w:t>
+        <w:t>Para completar el sistema se asumió b = [1,2,3,4,5,6,7,8,9,10]ᵀ. En C++ se implementó eliminación gaussiana con pivoteo parcial y se emplearon las factorizaciones LU y QR de Eigen3. En Octave se compararon A\b, LU y QR.</w:t>
       </w:r>
     </w:p>
     <w:p>
       <w:r>
-        <w:t>La pseudoinversa obtenida fue:</w:t>
-      </w:r>
-    </w:p>
-    <w:p>
-      <w:pPr>
-        <w:pStyle w:val="Código"/>
-      </w:pPr>
-      <w:r>
-        <w:t>A⁺ ≈ [ 0.051282   0.076923   0.025641   0.128205;</w:t>
+        <w:t>Los tres métodos produjeron la misma solución, dentro de la precisión numérica:</w:t>
         <w:br/>
-        <w:t xml:space="preserve">       0.043590   0.015385   0.071795   0.258974;</w:t>
-        <w:br/>
-        <w:t xml:space="preserve">       0.058974   0.138462  -0.020513  -0.002564 ]</w:t>
-      </w:r>
-    </w:p>
-    <w:p>
-      <w:pPr>
-        <w:pStyle w:val="Heading2"/>
-      </w:pPr>
-      <w:r>
-        <w:t>2.1 Verificación de las cuatro propiedades</w:t>
-      </w:r>
-    </w:p>
-    <w:p>
-      <w:pPr/>
-      <w:r>
-        <w:t>A A⁺ A = A</w:t>
-      </w:r>
-    </w:p>
-    <w:p>
-      <w:pPr/>
-      <w:r>
-        <w:t>A⁺ A A⁺ = A⁺</w:t>
-      </w:r>
-    </w:p>
-    <w:p>
-      <w:pPr/>
-      <w:r>
-        <w:t>(A A⁺)ᵀ = A A⁺</w:t>
-      </w:r>
-    </w:p>
-    <w:p>
-      <w:pPr/>
-      <w:r>
-        <w:t>(A⁺ A)ᵀ = A⁺ A</w:t>
-      </w:r>
-    </w:p>
-    <w:p>
-      <w:r>
-        <w:t>Las cuatro condiciones se verificaron numéricamente en Octave y en Eigen3. Los errores obtenidos estuvieron aproximadamente entre 10⁻¹⁵ y 10⁻¹⁶, magnitudes compatibles con el redondeo de punto flotante, por lo que puede considerarse que las cuatro propiedades de Moore-Penrose se satisfacen numéricamente.</w:t>
-      </w:r>
-    </w:p>
-    <w:p>
-      <w:pPr>
-        <w:pStyle w:val="Heading2"/>
-      </w:pPr>
-      <w:r>
-        <w:t>2.2 Implementación</w:t>
-      </w:r>
-    </w:p>
-    <w:p>
-      <w:r>
-        <w:t>En Octave se utilizó pinv(A). En C++/Eigen3 la pseudoinversa se construyó mediante descomposición en valores singulares (JacobiSVD), invirtiendo únicamente los valores singulares superiores a una tolerancia numérica.</w:t>
-      </w:r>
-    </w:p>
-    <w:p>
-      <w:pPr>
-        <w:pStyle w:val="Heading1"/>
-      </w:pPr>
-      <w:r>
-        <w:t>3. Punto 3 – Condicionamiento numérico y estabilidad</w:t>
-      </w:r>
-    </w:p>
-    <w:p>
-      <w:r>
-        <w:t>Para estudiar un caso mal condicionado se empleó la matriz de Hilbert de orden 5, una matriz clásica para analizar sensibilidad numérica. Se definió x = [1,1,1,1,1]ᵀ y b = Ax.</w:t>
-      </w:r>
-    </w:p>
-    <w:tbl>
-      <w:tblPr>
-        <w:tblStyle w:val="TableGrid"/>
-        <w:tblW w:type="auto" w:w="0"/>
-        <w:jc w:val="center"/>
-        <w:tblLook w:firstColumn="1" w:firstRow="1" w:lastColumn="0" w:lastRow="0" w:noHBand="0" w:noVBand="1" w:val="04A0"/>
-      </w:tblPr>
-      <w:tblGrid>
-        <w:gridCol w:w="4968"/>
-        <w:gridCol w:w="4968"/>
-      </w:tblGrid>
-      <w:tr>
-        <w:tc>
-          <w:tcPr>
-            <w:tcW w:type="dxa" w:w="4968"/>
-          </w:tcPr>
-          <w:p>
-            <w:r>
-              <w:t>Magnitud</w:t>
-            </w:r>
-          </w:p>
-        </w:tc>
-        <w:tc>
-          <w:tcPr>
-            <w:tcW w:type="dxa" w:w="4968"/>
-          </w:tcPr>
-          <w:p>
-            <w:r>
-              <w:t>Resultado</w:t>
-            </w:r>
-          </w:p>
-        </w:tc>
-      </w:tr>
-      <w:tr>
-        <w:tc>
-          <w:tcPr>
-            <w:tcW w:type="dxa" w:w="4968"/>
-          </w:tcPr>
-          <w:p>
-            <w:r>
-              <w:t>Número de condición κ(A)</w:t>
-            </w:r>
-          </w:p>
-        </w:tc>
-        <w:tc>
-          <w:tcPr>
-            <w:tcW w:type="dxa" w:w="4968"/>
-          </w:tcPr>
-          <w:p>
-            <w:r>
-              <w:t>4.7661 × 10⁵ (Octave); 476607 (Eigen3)</w:t>
-            </w:r>
-          </w:p>
-        </w:tc>
-      </w:tr>
-      <w:tr>
-        <w:tc>
-          <w:tcPr>
-            <w:tcW w:type="dxa" w:w="4968"/>
-          </w:tcPr>
-          <w:p>
-            <w:r>
-              <w:t>Perturbación aplicada</w:t>
-            </w:r>
-          </w:p>
-        </w:tc>
-        <w:tc>
-          <w:tcPr>
-            <w:tcW w:type="dxa" w:w="4968"/>
-          </w:tcPr>
-          <w:p>
-            <w:r>
-              <w:t>b₁ ← b₁ + 10⁻⁵</w:t>
-            </w:r>
-          </w:p>
-        </w:tc>
-      </w:tr>
-      <w:tr>
-        <w:tc>
-          <w:tcPr>
-            <w:tcW w:type="dxa" w:w="4968"/>
-          </w:tcPr>
-          <w:p>
-            <w:r>
-              <w:t>Error relativo de la solución</w:t>
-            </w:r>
-          </w:p>
-        </w:tc>
-        <w:tc>
-          <w:tcPr>
-            <w:tcW w:type="dxa" w:w="4968"/>
-          </w:tcPr>
-          <w:p>
-            <w:r>
-              <w:t>8.4262 × 10⁻³ ≈ 0.84262 %</w:t>
-            </w:r>
-          </w:p>
-        </w:tc>
-      </w:tr>
-    </w:tbl>
-    <w:p>
-      <w:r>
-        <w:t>La solución sin perturbación reprodujo x = [1,1,1,1,1]ᵀ. Después de perturbar b, la solución aproximada fue [1.0002, 0.9970, 1.0105, 0.9860, 1.0063]ᵀ. El elevado número de condición muestra que pequeñas perturbaciones en los datos pueden amplificarse significativamente en la solución. El resultado de Octave y Eigen3 fue consistente.</w:t>
-      </w:r>
-    </w:p>
-    <w:p>
-      <w:pPr>
-        <w:pStyle w:val="Heading1"/>
-      </w:pPr>
-      <w:r>
-        <w:t>4. Punto 4 – Inversa mediante método directo, QR y SVD</w:t>
-      </w:r>
-    </w:p>
-    <w:p>
-      <w:r>
-        <w:t>Se reutilizó la matriz de Hilbert de orden 5 para comparar tres estrategias de inversión en un caso numéricamente sensible. La calidad se evaluó mediante el residuo ||AA⁻¹ − I||.</w:t>
+        <w:t>x ≈ [-0.5402100241, -4.1975720146, -2.1442633550, -4.0005796843, 3.1458128957, 1.3559261571, 3.5632413270, -2.4104833675, 3.1812739677, 3.0679679836]ᵀ.</w:t>
       </w:r>
     </w:p>
     <w:tbl>
@@ -340,12 +122,23 @@
         <w:gridCol w:w="3312"/>
       </w:tblGrid>
       <w:tr>
+        <w:trPr>
+          <w:tblHeader w:val="true"/>
+        </w:trPr>
         <w:tc>
           <w:tcPr>
             <w:tcW w:type="dxa" w:w="3312"/>
+            <w:vAlign w:val="center"/>
           </w:tcPr>
           <w:p>
+            <w:pPr>
+              <w:spacing w:after="0"/>
+            </w:pPr>
             <w:r>
+              <w:rPr>
+                <w:rFonts w:ascii="Arial" w:hAnsi="Arial"/>
+                <w:sz w:val="18"/>
+              </w:rPr>
               <w:t>Método</w:t>
             </w:r>
           </w:p>
@@ -353,20 +146,36 @@
         <w:tc>
           <w:tcPr>
             <w:tcW w:type="dxa" w:w="3312"/>
+            <w:vAlign w:val="center"/>
           </w:tcPr>
           <w:p>
+            <w:pPr>
+              <w:spacing w:after="0"/>
+            </w:pPr>
             <w:r>
-              <w:t>Octave</w:t>
+              <w:rPr>
+                <w:rFonts w:ascii="Arial" w:hAnsi="Arial"/>
+                <w:sz w:val="18"/>
+              </w:rPr>
+              <w:t>Residuo C++</w:t>
             </w:r>
           </w:p>
         </w:tc>
         <w:tc>
           <w:tcPr>
             <w:tcW w:type="dxa" w:w="3312"/>
+            <w:vAlign w:val="center"/>
           </w:tcPr>
           <w:p>
+            <w:pPr>
+              <w:spacing w:after="0"/>
+            </w:pPr>
             <w:r>
-              <w:t>C++ / Eigen3</w:t>
+              <w:rPr>
+                <w:rFonts w:ascii="Arial" w:hAnsi="Arial"/>
+                <w:sz w:val="18"/>
+              </w:rPr>
+              <w:t>Residuo Octave</w:t>
             </w:r>
           </w:p>
         </w:tc>
@@ -375,30 +184,54 @@
         <w:tc>
           <w:tcPr>
             <w:tcW w:type="dxa" w:w="3312"/>
+            <w:vAlign w:val="center"/>
           </w:tcPr>
           <w:p>
+            <w:pPr>
+              <w:spacing w:after="0"/>
+            </w:pPr>
             <w:r>
-              <w:t>Inversa directa</w:t>
+              <w:rPr>
+                <w:rFonts w:ascii="Arial" w:hAnsi="Arial"/>
+                <w:sz w:val="18"/>
+              </w:rPr>
+              <w:t>Gauss / A\b</w:t>
             </w:r>
           </w:p>
         </w:tc>
         <w:tc>
           <w:tcPr>
             <w:tcW w:type="dxa" w:w="3312"/>
+            <w:vAlign w:val="center"/>
           </w:tcPr>
           <w:p>
+            <w:pPr>
+              <w:spacing w:after="0"/>
+            </w:pPr>
             <w:r>
-              <w:t>6.19865 × 10⁻¹²</w:t>
+              <w:rPr>
+                <w:rFonts w:ascii="Arial" w:hAnsi="Arial"/>
+                <w:sz w:val="18"/>
+              </w:rPr>
+              <w:t>8.57×10⁻¹⁵</w:t>
             </w:r>
           </w:p>
         </w:tc>
         <w:tc>
           <w:tcPr>
             <w:tcW w:type="dxa" w:w="3312"/>
+            <w:vAlign w:val="center"/>
           </w:tcPr>
           <w:p>
+            <w:pPr>
+              <w:spacing w:after="0"/>
+            </w:pPr>
             <w:r>
-              <w:t>3.55899 × 10⁻¹²</w:t>
+              <w:rPr>
+                <w:rFonts w:ascii="Arial" w:hAnsi="Arial"/>
+                <w:sz w:val="18"/>
+              </w:rPr>
+              <w:t>6.40×10⁻¹⁵</w:t>
             </w:r>
           </w:p>
         </w:tc>
@@ -407,30 +240,54 @@
         <w:tc>
           <w:tcPr>
             <w:tcW w:type="dxa" w:w="3312"/>
+            <w:vAlign w:val="center"/>
           </w:tcPr>
           <w:p>
+            <w:pPr>
+              <w:spacing w:after="0"/>
+            </w:pPr>
             <w:r>
-              <w:t>QR</w:t>
+              <w:rPr>
+                <w:rFonts w:ascii="Arial" w:hAnsi="Arial"/>
+                <w:sz w:val="18"/>
+              </w:rPr>
+              <w:t>LU</w:t>
             </w:r>
           </w:p>
         </w:tc>
         <w:tc>
           <w:tcPr>
             <w:tcW w:type="dxa" w:w="3312"/>
+            <w:vAlign w:val="center"/>
           </w:tcPr>
           <w:p>
+            <w:pPr>
+              <w:spacing w:after="0"/>
+            </w:pPr>
             <w:r>
-              <w:t>2.74385 × 10⁻¹¹</w:t>
+              <w:rPr>
+                <w:rFonts w:ascii="Arial" w:hAnsi="Arial"/>
+                <w:sz w:val="18"/>
+              </w:rPr>
+              <w:t>1.29×10⁻¹⁴</w:t>
             </w:r>
           </w:p>
         </w:tc>
         <w:tc>
           <w:tcPr>
             <w:tcW w:type="dxa" w:w="3312"/>
+            <w:vAlign w:val="center"/>
           </w:tcPr>
           <w:p>
+            <w:pPr>
+              <w:spacing w:after="0"/>
+            </w:pPr>
             <w:r>
-              <w:t>1.05479 × 10⁻¹¹</w:t>
+              <w:rPr>
+                <w:rFonts w:ascii="Arial" w:hAnsi="Arial"/>
+                <w:sz w:val="18"/>
+              </w:rPr>
+              <w:t>6.40×10⁻¹⁵</w:t>
             </w:r>
           </w:p>
         </w:tc>
@@ -439,30 +296,54 @@
         <w:tc>
           <w:tcPr>
             <w:tcW w:type="dxa" w:w="3312"/>
+            <w:vAlign w:val="center"/>
           </w:tcPr>
           <w:p>
+            <w:pPr>
+              <w:spacing w:after="0"/>
+            </w:pPr>
             <w:r>
-              <w:t>SVD</w:t>
+              <w:rPr>
+                <w:rFonts w:ascii="Arial" w:hAnsi="Arial"/>
+                <w:sz w:val="18"/>
+              </w:rPr>
+              <w:t>QR</w:t>
             </w:r>
           </w:p>
         </w:tc>
         <w:tc>
           <w:tcPr>
             <w:tcW w:type="dxa" w:w="3312"/>
+            <w:vAlign w:val="center"/>
           </w:tcPr>
           <w:p>
+            <w:pPr>
+              <w:spacing w:after="0"/>
+            </w:pPr>
             <w:r>
-              <w:t>3.21896 × 10⁻¹¹</w:t>
+              <w:rPr>
+                <w:rFonts w:ascii="Arial" w:hAnsi="Arial"/>
+                <w:sz w:val="18"/>
+              </w:rPr>
+              <w:t>2.12×10⁻¹⁴</w:t>
             </w:r>
           </w:p>
         </w:tc>
         <w:tc>
           <w:tcPr>
             <w:tcW w:type="dxa" w:w="3312"/>
+            <w:vAlign w:val="center"/>
           </w:tcPr>
           <w:p>
+            <w:pPr>
+              <w:spacing w:after="0"/>
+            </w:pPr>
             <w:r>
-              <w:t>3.72883 × 10⁻¹¹</w:t>
+              <w:rPr>
+                <w:rFonts w:ascii="Arial" w:hAnsi="Arial"/>
+                <w:sz w:val="18"/>
+              </w:rPr>
+              <w:t>1.56×10⁻¹⁴</w:t>
             </w:r>
           </w:p>
         </w:tc>
@@ -470,7 +351,7 @@
     </w:tbl>
     <w:p>
       <w:r>
-        <w:t>Los tres métodos generaron prácticamente la misma inversa y residuos muy pequeños. En este caso particular, la inversión directa presentó el menor residuo; sin embargo, esto no implica que sea siempre el procedimiento más estable. QR evita algunas operaciones que pueden amplificar errores, mientras que SVD es especialmente útil en matrices cercanas a singularidad o con problemas de rango, ya que expone explícitamente los valores singulares.</w:t>
+        <w:t>El número de condición fue κ(A) ≈ 51.715, correspondiente a un condicionamiento moderado. Los tiempos de una única ejecución de una matriz 10×10 no deben interpretarse como una comparación universal. LU es especialmente conveniente cuando se reutiliza la misma matriz con varios vectores b, mientras que QR ofrece buenas propiedades de estabilidad numérica.</w:t>
       </w:r>
     </w:p>
     <w:p>
@@ -478,275 +359,48 @@
         <w:pStyle w:val="Heading1"/>
       </w:pPr>
       <w:r>
-        <w:t>5. Punto 5 – Mínimos cuadrados: convertidor DC–DC</w:t>
+        <w:t>3. Punto 3 – Condicionamiento y estabilidad numérica</w:t>
       </w:r>
     </w:p>
     <w:p>
       <w:r>
-        <w:t>Se emplearon 100 mediciones de voltaje de entrada V, corriente de carga I, temperatura del disipador T y potencia de salida P. El modelo lineal multivariable utilizado fue:</w:t>
+        <w:t>Se utilizó una matriz de Hilbert de orden 5 como ejemplo de matriz mal condicionada. Se obtuvo cond(A) = 4.7661×10⁵. Tomando x = [1,1,1,1,1]ᵀ y perturbando únicamente la primera componente de b en 10⁻⁵, el error relativo de la solución fue 8.4262×10⁻³, equivalente a 0.842618 %.</w:t>
+      </w:r>
+    </w:p>
+    <w:p>
+      <w:r>
+        <w:t>El resultado evidencia que una perturbación pequeña en los datos puede producir una variación apreciable en la solución cuando la matriz está fuertemente mal condicionada.</w:t>
       </w:r>
     </w:p>
     <w:p>
       <w:pPr>
-        <w:jc w:val="center"/>
+        <w:pStyle w:val="Heading1"/>
       </w:pPr>
       <w:r>
-        <w:rPr>
-          <w:b/>
-          <w:sz w:val="24"/>
-        </w:rPr>
-        <w:t>P = β₀ + β₁V + β₂I + β₃T</w:t>
+        <w:t>4. Punto 4 – Inversa mediante método directo, QR y SVD</w:t>
+      </w:r>
+    </w:p>
+    <w:p>
+      <w:r>
+        <w:t>Para la matriz de Hilbert de orden 5 se calculó la inversa mediante inv(A), factorización QR y descomposición SVD. En Octave los errores ||AA⁻¹−I|| fueron aproximadamente 6.20×10⁻¹² (directa), 2.74×10⁻¹¹ (QR) y 3.22×10⁻¹¹ (SVD). En C++/Eigen3 se obtuvieron valores del mismo orden.</w:t>
+      </w:r>
+    </w:p>
+    <w:p>
+      <w:r>
+        <w:t>Que la inversión directa presente el menor residuo en esta prueba particular no significa que sea universalmente el método más estable. QR y SVD son herramientas importantes cuando aparecen problemas mal condicionados o cercanos a singularidad.</w:t>
       </w:r>
     </w:p>
     <w:p>
       <w:pPr>
-        <w:pStyle w:val="Heading2"/>
+        <w:pStyle w:val="Heading1"/>
       </w:pPr>
       <w:r>
-        <w:t>5.1 Coeficientes estimados</w:t>
-      </w:r>
-    </w:p>
-    <w:tbl>
-      <w:tblPr>
-        <w:tblStyle w:val="TableGrid"/>
-        <w:tblW w:type="auto" w:w="0"/>
-        <w:jc w:val="center"/>
-        <w:tblLook w:firstColumn="1" w:firstRow="1" w:lastColumn="0" w:lastRow="0" w:noHBand="0" w:noVBand="1" w:val="04A0"/>
-      </w:tblPr>
-      <w:tblGrid>
-        <w:gridCol w:w="2484"/>
-        <w:gridCol w:w="2484"/>
-        <w:gridCol w:w="2484"/>
-        <w:gridCol w:w="2484"/>
-      </w:tblGrid>
-      <w:tr>
-        <w:tc>
-          <w:tcPr>
-            <w:tcW w:type="dxa" w:w="2484"/>
-          </w:tcPr>
-          <w:p>
-            <w:r>
-              <w:t>Coeficiente</w:t>
-            </w:r>
-          </w:p>
-        </w:tc>
-        <w:tc>
-          <w:tcPr>
-            <w:tcW w:type="dxa" w:w="2484"/>
-          </w:tcPr>
-          <w:p>
-            <w:r>
-              <w:t>Significado</w:t>
-            </w:r>
-          </w:p>
-        </w:tc>
-        <w:tc>
-          <w:tcPr>
-            <w:tcW w:type="dxa" w:w="2484"/>
-          </w:tcPr>
-          <w:p>
-            <w:r>
-              <w:t>Octave</w:t>
-            </w:r>
-          </w:p>
-        </w:tc>
-        <w:tc>
-          <w:tcPr>
-            <w:tcW w:type="dxa" w:w="2484"/>
-          </w:tcPr>
-          <w:p>
-            <w:r>
-              <w:t>Eigen3</w:t>
-            </w:r>
-          </w:p>
-        </w:tc>
-      </w:tr>
-      <w:tr>
-        <w:tc>
-          <w:tcPr>
-            <w:tcW w:type="dxa" w:w="2484"/>
-          </w:tcPr>
-          <w:p>
-            <w:r>
-              <w:t>β₀</w:t>
-            </w:r>
-          </w:p>
-        </w:tc>
-        <w:tc>
-          <w:tcPr>
-            <w:tcW w:type="dxa" w:w="2484"/>
-          </w:tcPr>
-          <w:p>
-            <w:r>
-              <w:t>Intercepto</w:t>
-            </w:r>
-          </w:p>
-        </w:tc>
-        <w:tc>
-          <w:tcPr>
-            <w:tcW w:type="dxa" w:w="2484"/>
-          </w:tcPr>
-          <w:p>
-            <w:r>
-              <w:t>-123.418350</w:t>
-            </w:r>
-          </w:p>
-        </w:tc>
-        <w:tc>
-          <w:tcPr>
-            <w:tcW w:type="dxa" w:w="2484"/>
-          </w:tcPr>
-          <w:p>
-            <w:r>
-              <w:t>-123.418</w:t>
-            </w:r>
-          </w:p>
-        </w:tc>
-      </w:tr>
-      <w:tr>
-        <w:tc>
-          <w:tcPr>
-            <w:tcW w:type="dxa" w:w="2484"/>
-          </w:tcPr>
-          <w:p>
-            <w:r>
-              <w:t>β₁</w:t>
-            </w:r>
-          </w:p>
-        </w:tc>
-        <w:tc>
-          <w:tcPr>
-            <w:tcW w:type="dxa" w:w="2484"/>
-          </w:tcPr>
-          <w:p>
-            <w:r>
-              <w:t>Voltaje</w:t>
-            </w:r>
-          </w:p>
-        </w:tc>
-        <w:tc>
-          <w:tcPr>
-            <w:tcW w:type="dxa" w:w="2484"/>
-          </w:tcPr>
-          <w:p>
-            <w:r>
-              <w:t>6.322569</w:t>
-            </w:r>
-          </w:p>
-        </w:tc>
-        <w:tc>
-          <w:tcPr>
-            <w:tcW w:type="dxa" w:w="2484"/>
-          </w:tcPr>
-          <w:p>
-            <w:r>
-              <w:t>6.32257</w:t>
-            </w:r>
-          </w:p>
-        </w:tc>
-      </w:tr>
-      <w:tr>
-        <w:tc>
-          <w:tcPr>
-            <w:tcW w:type="dxa" w:w="2484"/>
-          </w:tcPr>
-          <w:p>
-            <w:r>
-              <w:t>β₂</w:t>
-            </w:r>
-          </w:p>
-        </w:tc>
-        <w:tc>
-          <w:tcPr>
-            <w:tcW w:type="dxa" w:w="2484"/>
-          </w:tcPr>
-          <w:p>
-            <w:r>
-              <w:t>Corriente</w:t>
-            </w:r>
-          </w:p>
-        </w:tc>
-        <w:tc>
-          <w:tcPr>
-            <w:tcW w:type="dxa" w:w="2484"/>
-          </w:tcPr>
-          <w:p>
-            <w:r>
-              <w:t>19.042068</w:t>
-            </w:r>
-          </w:p>
-        </w:tc>
-        <w:tc>
-          <w:tcPr>
-            <w:tcW w:type="dxa" w:w="2484"/>
-          </w:tcPr>
-          <w:p>
-            <w:r>
-              <w:t>19.0421</w:t>
-            </w:r>
-          </w:p>
-        </w:tc>
-      </w:tr>
-      <w:tr>
-        <w:tc>
-          <w:tcPr>
-            <w:tcW w:type="dxa" w:w="2484"/>
-          </w:tcPr>
-          <w:p>
-            <w:r>
-              <w:t>β₃</w:t>
-            </w:r>
-          </w:p>
-        </w:tc>
-        <w:tc>
-          <w:tcPr>
-            <w:tcW w:type="dxa" w:w="2484"/>
-          </w:tcPr>
-          <w:p>
-            <w:r>
-              <w:t>Temperatura</w:t>
-            </w:r>
-          </w:p>
-        </w:tc>
-        <w:tc>
-          <w:tcPr>
-            <w:tcW w:type="dxa" w:w="2484"/>
-          </w:tcPr>
-          <w:p>
-            <w:r>
-              <w:t>-0.206825</w:t>
-            </w:r>
-          </w:p>
-        </w:tc>
-        <w:tc>
-          <w:tcPr>
-            <w:tcW w:type="dxa" w:w="2484"/>
-          </w:tcPr>
-          <w:p>
-            <w:r>
-              <w:t>-0.206825</w:t>
-            </w:r>
-          </w:p>
-        </w:tc>
-      </w:tr>
-    </w:tbl>
-    <w:p>
-      <w:pPr>
-        <w:jc w:val="center"/>
-      </w:pPr>
-      <w:r>
-        <w:rPr>
-          <w:b/>
-        </w:rPr>
-        <w:t>P ≈ -123.418 + 6.32257V + 19.0421I - 0.206825T</w:t>
+        <w:t>5. Punto 5 – Mínimos cuadrados: convertidor DC-DC</w:t>
       </w:r>
     </w:p>
     <w:p>
-      <w:pPr>
-        <w:pStyle w:val="Heading2"/>
-      </w:pPr>
       <w:r>
-        <w:t>5.2 Residuos, MSE y condicionamiento</w:t>
+        <w:t>Con 100 muestras de voltaje V, corriente I, temperatura T y potencia P se ajustó el modelo P = β₀ + β₁V + β₂I + β₃T mediante mínimos cuadrados. Octave y C++/Eigen3 produjeron coeficientes coincidentes dentro de la precisión numérica.</w:t>
       </w:r>
     </w:p>
     <w:tbl>
@@ -762,33 +416,60 @@
         <w:gridCol w:w="3312"/>
       </w:tblGrid>
       <w:tr>
+        <w:trPr>
+          <w:tblHeader w:val="true"/>
+        </w:trPr>
         <w:tc>
           <w:tcPr>
             <w:tcW w:type="dxa" w:w="3312"/>
+            <w:vAlign w:val="center"/>
           </w:tcPr>
           <w:p>
+            <w:pPr>
+              <w:spacing w:after="0"/>
+            </w:pPr>
             <w:r>
-              <w:t>Indicador</w:t>
+              <w:rPr>
+                <w:rFonts w:ascii="Arial" w:hAnsi="Arial"/>
+                <w:sz w:val="18"/>
+              </w:rPr>
+              <w:t>Coeficiente</w:t>
             </w:r>
           </w:p>
         </w:tc>
         <w:tc>
           <w:tcPr>
             <w:tcW w:type="dxa" w:w="3312"/>
+            <w:vAlign w:val="center"/>
           </w:tcPr>
           <w:p>
+            <w:pPr>
+              <w:spacing w:after="0"/>
+            </w:pPr>
             <w:r>
-              <w:t>Octave</w:t>
+              <w:rPr>
+                <w:rFonts w:ascii="Arial" w:hAnsi="Arial"/>
+                <w:sz w:val="18"/>
+              </w:rPr>
+              <w:t>Valor</w:t>
             </w:r>
           </w:p>
         </w:tc>
         <w:tc>
           <w:tcPr>
             <w:tcW w:type="dxa" w:w="3312"/>
+            <w:vAlign w:val="center"/>
           </w:tcPr>
           <w:p>
+            <w:pPr>
+              <w:spacing w:after="0"/>
+            </w:pPr>
             <w:r>
-              <w:t>Eigen3</w:t>
+              <w:rPr>
+                <w:rFonts w:ascii="Arial" w:hAnsi="Arial"/>
+                <w:sz w:val="18"/>
+              </w:rPr>
+              <w:t>Interpretación</w:t>
             </w:r>
           </w:p>
         </w:tc>
@@ -797,30 +478,54 @@
         <w:tc>
           <w:tcPr>
             <w:tcW w:type="dxa" w:w="3312"/>
+            <w:vAlign w:val="center"/>
           </w:tcPr>
           <w:p>
+            <w:pPr>
+              <w:spacing w:after="0"/>
+            </w:pPr>
             <w:r>
-              <w:t>Norma de residuos</w:t>
+              <w:rPr>
+                <w:rFonts w:ascii="Arial" w:hAnsi="Arial"/>
+                <w:sz w:val="18"/>
+              </w:rPr>
+              <w:t>β₀</w:t>
             </w:r>
           </w:p>
         </w:tc>
         <w:tc>
           <w:tcPr>
             <w:tcW w:type="dxa" w:w="3312"/>
+            <w:vAlign w:val="center"/>
           </w:tcPr>
           <w:p>
+            <w:pPr>
+              <w:spacing w:after="0"/>
+            </w:pPr>
             <w:r>
-              <w:t>155.040807</w:t>
+              <w:rPr>
+                <w:rFonts w:ascii="Arial" w:hAnsi="Arial"/>
+                <w:sz w:val="18"/>
+              </w:rPr>
+              <w:t>-123.418350</w:t>
             </w:r>
           </w:p>
         </w:tc>
         <w:tc>
           <w:tcPr>
             <w:tcW w:type="dxa" w:w="3312"/>
+            <w:vAlign w:val="center"/>
           </w:tcPr>
           <w:p>
+            <w:pPr>
+              <w:spacing w:after="0"/>
+            </w:pPr>
             <w:r>
-              <w:t>155.041</w:t>
+              <w:rPr>
+                <w:rFonts w:ascii="Arial" w:hAnsi="Arial"/>
+                <w:sz w:val="18"/>
+              </w:rPr>
+              <w:t>Intercepto matemático</w:t>
             </w:r>
           </w:p>
         </w:tc>
@@ -829,30 +534,54 @@
         <w:tc>
           <w:tcPr>
             <w:tcW w:type="dxa" w:w="3312"/>
+            <w:vAlign w:val="center"/>
           </w:tcPr>
           <w:p>
+            <w:pPr>
+              <w:spacing w:after="0"/>
+            </w:pPr>
             <w:r>
-              <w:t>Error cuadrático medio (MSE)</w:t>
+              <w:rPr>
+                <w:rFonts w:ascii="Arial" w:hAnsi="Arial"/>
+                <w:sz w:val="18"/>
+              </w:rPr>
+              <w:t>β₁</w:t>
             </w:r>
           </w:p>
         </w:tc>
         <w:tc>
           <w:tcPr>
             <w:tcW w:type="dxa" w:w="3312"/>
+            <w:vAlign w:val="center"/>
           </w:tcPr>
           <w:p>
+            <w:pPr>
+              <w:spacing w:after="0"/>
+            </w:pPr>
             <w:r>
-              <w:t>240.376517</w:t>
+              <w:rPr>
+                <w:rFonts w:ascii="Arial" w:hAnsi="Arial"/>
+                <w:sz w:val="18"/>
+              </w:rPr>
+              <w:t>6.322569</w:t>
             </w:r>
           </w:p>
         </w:tc>
         <w:tc>
           <w:tcPr>
             <w:tcW w:type="dxa" w:w="3312"/>
+            <w:vAlign w:val="center"/>
           </w:tcPr>
           <w:p>
+            <w:pPr>
+              <w:spacing w:after="0"/>
+            </w:pPr>
             <w:r>
-              <w:t>240.377</w:t>
+              <w:rPr>
+                <w:rFonts w:ascii="Arial" w:hAnsi="Arial"/>
+                <w:sz w:val="18"/>
+              </w:rPr>
+              <w:t>Cambio estimado en P por +1 V, manteniendo I y T</w:t>
             </w:r>
           </w:p>
         </w:tc>
@@ -861,30 +590,54 @@
         <w:tc>
           <w:tcPr>
             <w:tcW w:type="dxa" w:w="3312"/>
+            <w:vAlign w:val="center"/>
           </w:tcPr>
           <w:p>
+            <w:pPr>
+              <w:spacing w:after="0"/>
+            </w:pPr>
             <w:r>
-              <w:t>Máximo residuo absoluto</w:t>
+              <w:rPr>
+                <w:rFonts w:ascii="Arial" w:hAnsi="Arial"/>
+                <w:sz w:val="18"/>
+              </w:rPr>
+              <w:t>β₂</w:t>
             </w:r>
           </w:p>
         </w:tc>
         <w:tc>
           <w:tcPr>
             <w:tcW w:type="dxa" w:w="3312"/>
+            <w:vAlign w:val="center"/>
           </w:tcPr>
           <w:p>
+            <w:pPr>
+              <w:spacing w:after="0"/>
+            </w:pPr>
             <w:r>
-              <w:t>47.957115</w:t>
+              <w:rPr>
+                <w:rFonts w:ascii="Arial" w:hAnsi="Arial"/>
+                <w:sz w:val="18"/>
+              </w:rPr>
+              <w:t>19.042068</w:t>
             </w:r>
           </w:p>
         </w:tc>
         <w:tc>
           <w:tcPr>
             <w:tcW w:type="dxa" w:w="3312"/>
+            <w:vAlign w:val="center"/>
           </w:tcPr>
           <w:p>
+            <w:pPr>
+              <w:spacing w:after="0"/>
+            </w:pPr>
             <w:r>
-              <w:t>47.9571</w:t>
+              <w:rPr>
+                <w:rFonts w:ascii="Arial" w:hAnsi="Arial"/>
+                <w:sz w:val="18"/>
+              </w:rPr>
+              <w:t>Cambio estimado en P por +1 A, manteniendo V y T</w:t>
             </w:r>
           </w:p>
         </w:tc>
@@ -893,30 +646,54 @@
         <w:tc>
           <w:tcPr>
             <w:tcW w:type="dxa" w:w="3312"/>
+            <w:vAlign w:val="center"/>
           </w:tcPr>
           <w:p>
+            <w:pPr>
+              <w:spacing w:after="0"/>
+            </w:pPr>
             <w:r>
-              <w:t>Número de condición κ(X)</w:t>
+              <w:rPr>
+                <w:rFonts w:ascii="Arial" w:hAnsi="Arial"/>
+                <w:sz w:val="18"/>
+              </w:rPr>
+              <w:t>β₃</w:t>
             </w:r>
           </w:p>
         </w:tc>
         <w:tc>
           <w:tcPr>
             <w:tcW w:type="dxa" w:w="3312"/>
+            <w:vAlign w:val="center"/>
           </w:tcPr>
           <w:p>
+            <w:pPr>
+              <w:spacing w:after="0"/>
+            </w:pPr>
             <w:r>
-              <w:t>347.216931</w:t>
+              <w:rPr>
+                <w:rFonts w:ascii="Arial" w:hAnsi="Arial"/>
+                <w:sz w:val="18"/>
+              </w:rPr>
+              <w:t>-0.206825</w:t>
             </w:r>
           </w:p>
         </w:tc>
         <w:tc>
           <w:tcPr>
             <w:tcW w:type="dxa" w:w="3312"/>
+            <w:vAlign w:val="center"/>
           </w:tcPr>
           <w:p>
+            <w:pPr>
+              <w:spacing w:after="0"/>
+            </w:pPr>
             <w:r>
-              <w:t>347.217</w:t>
+              <w:rPr>
+                <w:rFonts w:ascii="Arial" w:hAnsi="Arial"/>
+                <w:sz w:val="18"/>
+              </w:rPr>
+              <w:t>Cambio estimado en P por +1 °C, manteniendo V e I</w:t>
             </w:r>
           </w:p>
         </w:tc>
@@ -924,187 +701,27 @@
     </w:tbl>
     <w:p>
       <w:r>
-        <w:t>Se calculó explícitamente el vector residual r = y - Xβ̂ para las 100 observaciones. Como indicadores resumidos se obtuvo ||r||₂ = 155.040807, un error cuadrático medio MSE = 240.376517 y un residuo absoluto máximo de 47.957115. El número de condición de X es aproximadamente 347.22. Esto evidencia una sensibilidad numérica apreciable, aunque muy inferior a la observada en la matriz de Hilbert del Punto 3. Los resultados de Octave y Eigen3 coinciden dentro de la precisión numérica.</w:t>
+        <w:t>Modelo obtenido:</w:t>
+        <w:br/>
+        <w:t>P = -123.418350 + 6.322569V + 19.042068I - 0.206825T.</w:t>
+      </w:r>
+    </w:p>
+    <w:p>
+      <w:r>
+        <w:t>Se calculó el vector residual completo r = y - Xβ̂ para las 100 observaciones. Los indicadores resumidos fueron ||r||₂ = 155.040807, MSE = 240.376517 y residuo absoluto máximo = 47.957115. El número de condición de X fue 347.216931. La diferencia entre los coeficientes obtenidos mediante QR y ecuaciones normales fue del orden de 10⁻¹².</w:t>
+      </w:r>
+    </w:p>
+    <w:p>
+      <w:r>
+        <w:t>Al estandarizar las variables explicativas se obtuvieron magnitudes: Voltaje = 37.617343, Corriente = 55.813528 y Temperatura = -3.034362. Por magnitud absoluta, la corriente presenta la mayor influencia relativa, seguida del voltaje y finalmente la temperatura.</w:t>
       </w:r>
     </w:p>
     <w:p>
       <w:pPr>
-        <w:pStyle w:val="Heading2"/>
+        <w:pStyle w:val="Heading1"/>
       </w:pPr>
       <w:r>
-        <w:t>5.3 QR frente a ecuaciones normales</w:t>
-      </w:r>
-    </w:p>
-    <w:p>
-      <w:r>
-        <w:t>En Eigen3 se resolvió el ajuste mediante QR y también mediante ecuaciones normales. La norma de la diferencia entre ambos vectores de coeficientes fue 3.88207 × 10⁻¹², por lo que para estos datos las dos soluciones son prácticamente idénticas. Aun así, QR es preferible desde el punto de vista numérico porque evita formar explícitamente XᵀX, operación que puede deteriorar el condicionamiento.</w:t>
-      </w:r>
-    </w:p>
-    <w:p>
-      <w:pPr>
-        <w:pStyle w:val="Heading2"/>
-      </w:pPr>
-      <w:r>
-        <w:t>5.4 Influencia relativa de las variables</w:t>
-      </w:r>
-    </w:p>
-    <w:p>
-      <w:r>
-        <w:t>Como V, I y T poseen unidades y escalas diferentes, la magnitud de los coeficientes originales no debe usarse por sí sola para comparar influencia. Se estandarizaron las variables antes de repetir el ajuste.</w:t>
-      </w:r>
-    </w:p>
-    <w:tbl>
-      <w:tblPr>
-        <w:tblStyle w:val="TableGrid"/>
-        <w:tblW w:type="auto" w:w="0"/>
-        <w:jc w:val="center"/>
-        <w:tblLook w:firstColumn="1" w:firstRow="1" w:lastColumn="0" w:lastRow="0" w:noHBand="0" w:noVBand="1" w:val="04A0"/>
-      </w:tblPr>
-      <w:tblGrid>
-        <w:gridCol w:w="3312"/>
-        <w:gridCol w:w="3312"/>
-        <w:gridCol w:w="3312"/>
-      </w:tblGrid>
-      <w:tr>
-        <w:tc>
-          <w:tcPr>
-            <w:tcW w:type="dxa" w:w="3312"/>
-          </w:tcPr>
-          <w:p>
-            <w:r>
-              <w:t>Variable</w:t>
-            </w:r>
-          </w:p>
-        </w:tc>
-        <w:tc>
-          <w:tcPr>
-            <w:tcW w:type="dxa" w:w="3312"/>
-          </w:tcPr>
-          <w:p>
-            <w:r>
-              <w:t>Coeficiente estandarizado</w:t>
-            </w:r>
-          </w:p>
-        </w:tc>
-        <w:tc>
-          <w:tcPr>
-            <w:tcW w:type="dxa" w:w="3312"/>
-          </w:tcPr>
-          <w:p>
-            <w:r>
-              <w:t>Magnitud</w:t>
-            </w:r>
-          </w:p>
-        </w:tc>
-      </w:tr>
-      <w:tr>
-        <w:tc>
-          <w:tcPr>
-            <w:tcW w:type="dxa" w:w="3312"/>
-          </w:tcPr>
-          <w:p>
-            <w:r>
-              <w:t>Voltaje</w:t>
-            </w:r>
-          </w:p>
-        </w:tc>
-        <w:tc>
-          <w:tcPr>
-            <w:tcW w:type="dxa" w:w="3312"/>
-          </w:tcPr>
-          <w:p>
-            <w:r>
-              <w:t>37.617343</w:t>
-            </w:r>
-          </w:p>
-        </w:tc>
-        <w:tc>
-          <w:tcPr>
-            <w:tcW w:type="dxa" w:w="3312"/>
-          </w:tcPr>
-          <w:p>
-            <w:r>
-              <w:t>37.617343</w:t>
-            </w:r>
-          </w:p>
-        </w:tc>
-      </w:tr>
-      <w:tr>
-        <w:tc>
-          <w:tcPr>
-            <w:tcW w:type="dxa" w:w="3312"/>
-          </w:tcPr>
-          <w:p>
-            <w:r>
-              <w:t>Corriente</w:t>
-            </w:r>
-          </w:p>
-        </w:tc>
-        <w:tc>
-          <w:tcPr>
-            <w:tcW w:type="dxa" w:w="3312"/>
-          </w:tcPr>
-          <w:p>
-            <w:r>
-              <w:t>55.813528</w:t>
-            </w:r>
-          </w:p>
-        </w:tc>
-        <w:tc>
-          <w:tcPr>
-            <w:tcW w:type="dxa" w:w="3312"/>
-          </w:tcPr>
-          <w:p>
-            <w:r>
-              <w:t>55.813528</w:t>
-            </w:r>
-          </w:p>
-        </w:tc>
-      </w:tr>
-      <w:tr>
-        <w:tc>
-          <w:tcPr>
-            <w:tcW w:type="dxa" w:w="3312"/>
-          </w:tcPr>
-          <w:p>
-            <w:r>
-              <w:t>Temperatura</w:t>
-            </w:r>
-          </w:p>
-        </w:tc>
-        <w:tc>
-          <w:tcPr>
-            <w:tcW w:type="dxa" w:w="3312"/>
-          </w:tcPr>
-          <w:p>
-            <w:r>
-              <w:t>-3.034362</w:t>
-            </w:r>
-          </w:p>
-        </w:tc>
-        <w:tc>
-          <w:tcPr>
-            <w:tcW w:type="dxa" w:w="3312"/>
-          </w:tcPr>
-          <w:p>
-            <w:r>
-              <w:t>3.034362</w:t>
-            </w:r>
-          </w:p>
-        </w:tc>
-      </w:tr>
-    </w:tbl>
-    <w:p>
-      <w:r>
-        <w:t>La corriente presenta la mayor influencia relativa sobre la potencia, seguida por el voltaje. La temperatura tiene una influencia mucho menor y de signo negativo.</w:t>
-      </w:r>
-    </w:p>
-    <w:p>
-      <w:pPr>
-        <w:pStyle w:val="Heading2"/>
-      </w:pPr>
-      <w:r>
-        <w:t>5.5 Respuestas a las preguntas de análisis</w:t>
+        <w:t>6. Respuestas al análisis del ejercicio práctico</w:t>
       </w:r>
     </w:p>
     <w:p>
@@ -1112,10 +729,10 @@
         <w:rPr>
           <w:b/>
         </w:rPr>
-        <w:t xml:space="preserve">1. ¿Qué variable tiene mayor impacto en la potencia? </w:t>
+        <w:t xml:space="preserve">1. Variable de mayor impacto: </w:t>
       </w:r>
       <w:r>
-        <w:t>La corriente. Los coeficientes estandarizados tienen magnitudes 55.81 para corriente, 37.62 para voltaje y 3.03 para temperatura.</w:t>
+        <w:t>la corriente, según los coeficientes obtenidos con las variables explicativas estandarizadas.</w:t>
       </w:r>
     </w:p>
     <w:p>
@@ -1123,10 +740,10 @@
         <w:rPr>
           <w:b/>
         </w:rPr>
-        <w:t xml:space="preserve">2. ¿Cómo influye la temperatura en el rendimiento? </w:t>
+        <w:t xml:space="preserve">2. Influencia de la temperatura: </w:t>
       </w:r>
       <w:r>
-        <w:t>El coeficiente β₃ = -0.206825 indica que, manteniendo V e I constantes, un aumento de 1 °C se asocia con una reducción aproximada de 0.207 W en la potencia predicha. Su influencia relativa es pequeña frente a V e I.</w:t>
+        <w:t>es negativa y pequeña en el rango analizado; β₃ ≈ -0.206825 W/°C manteniendo las demás variables constantes.</w:t>
       </w:r>
     </w:p>
     <w:p>
@@ -1134,10 +751,10 @@
         <w:rPr>
           <w:b/>
         </w:rPr>
-        <w:t xml:space="preserve">3. ¿Qué ocurre al aumentar el número de muestras? </w:t>
+        <w:t xml:space="preserve">3. Aumento del número de muestras: </w:t>
       </w:r>
       <w:r>
-        <w:t>Si las nuevas muestras son representativas, las estimaciones tienden a ser más robustas y menos sensibles al ruido o a observaciones individuales. Más muestras no corrigen por sí solas problemas de mala calidad de datos o multicolinealidad.</w:t>
+        <w:t>si las nuevas muestras son representativas y mantienen las condiciones del modelo, las estimaciones tienden a ganar precisión y estabilidad.</w:t>
       </w:r>
     </w:p>
     <w:p>
@@ -1145,10 +762,10 @@
         <w:rPr>
           <w:b/>
         </w:rPr>
-        <w:t xml:space="preserve">4. ¿Por qué QR es preferible a ecuaciones normales? </w:t>
+        <w:t xml:space="preserve">4. ¿Por qué QR frente a ecuaciones normales?: </w:t>
       </w:r>
       <w:r>
-        <w:t>Porque permite resolver el problema sin formar explícitamente XᵀX. Formar XᵀX puede agravar el condicionamiento y aumentar la sensibilidad a errores de redondeo.</w:t>
+        <w:t>QR evita formar explícitamente XᵀX; en norma 2 y con rango completo, el condicionamiento de XᵀX es aproximadamente el cuadrado del de X, por lo que las ecuaciones normales pueden amplificar problemas numéricos.</w:t>
       </w:r>
     </w:p>
     <w:p>
@@ -1156,32 +773,10 @@
         <w:rPr>
           <w:b/>
         </w:rPr>
-        <w:t xml:space="preserve">5. ¿Cómo se interpreta físicamente cada coeficiente? </w:t>
+        <w:t xml:space="preserve">5. Interpretación física: </w:t>
       </w:r>
       <w:r>
-        <w:t>β₀ es el intercepto matemático y no necesariamente representa un estado físico realizable. β₁ estima el cambio de potencia por voltio adicional, β₂ el cambio por amperio adicional y β₃ el cambio por grado Celsius adicional, manteniendo constantes las demás variables.</w:t>
-      </w:r>
-    </w:p>
-    <w:p>
-      <w:pPr>
-        <w:pStyle w:val="Heading1"/>
-      </w:pPr>
-      <w:r>
-        <w:t>6. Punto 2 – Sistema lineal 10×10: Gauss, LU y QR</w:t>
-      </w:r>
-    </w:p>
-    <w:p>
-      <w:r>
-        <w:t>El enunciado proporciona la matriz de coeficientes A de dimensión 10×10 pero no especifica el vector independiente b. Para completar el ejercicio y poder comparar los métodos, se asumió b = [1,2,3,4,5,6,7,8,9,10]ᵀ. Esta elección se realizó únicamente con fines de análisis numérico y se declara de forma explícita para no atribuirla al enunciado original.</w:t>
-      </w:r>
-    </w:p>
-    <w:p>
-      <w:r>
-        <w:t>El sistema se resolvió mediante eliminación gaussiana con pivoteo parcial, factorización LU y factorización QR. Los tres métodos produjeron, dentro de la precisión numérica, la misma solución:</w:t>
-        <w:br/>
-        <w:t>x ≈ [-0.5402100241, -4.1975720146, -2.1442633550, -4.0005796843, 3.1458128957, 1.3559261571, 3.5632413270, -2.4104833675, 3.1812739677, 3.0679679836]ᵀ.</w:t>
-        <w:br/>
-        <w:t>En C++/Eigen3 los residuos fueron 8.57×10⁻¹⁵ (Gauss), 1.29×10⁻¹⁴ (LU) y 2.12×10⁻¹⁴ (QR). En Octave fueron 6.40×10⁻¹⁵ (A\b), 6.40×10⁻¹⁵ (LU) y 1.56×10⁻¹⁴ (QR). El número de condición fue κ(A) ≈ 51.715, lo que indica un condicionamiento moderado. Las diferencias entre soluciones fueron nulas o del orden de 10⁻¹⁵. Para una matriz tan pequeña, los tiempos de una sola ejecución no deben interpretarse como una comparación universal de rendimiento; LU resulta especialmente útil cuando se reutiliza la misma matriz con varios vectores b, mientras que QR ofrece buenas propiedades de estabilidad numérica.</w:t>
+        <w:t>β₁, β₂ y β₃ representan cambios marginales estimados de potencia frente a V, I y T manteniendo las otras variables constantes; β₀ es el intercepto y puede no tener significado físico directo fuera del rango de datos.</w:t>
       </w:r>
     </w:p>
     <w:p>
@@ -1193,35 +788,43 @@
       </w:r>
     </w:p>
     <w:p>
+      <w:pPr>
+        <w:pStyle w:val="ListBullet"/>
+      </w:pPr>
       <w:r>
-        <w:t>La pseudoinversa de Moore-Penrose fue reproducida consistentemente en Octave y Eigen3 y satisfizo sus cuatro propiedades dentro de la precisión de punto flotante.</w:t>
-      </w:r>
-    </w:p>
-    <CT_P/>
-    <w:p>
-      <w:r>
-        <w:t>La matriz de Hilbert evidenció el efecto del mal condicionamiento: una perturbación de 10⁻⁵ en b produjo un error relativo cercano al 0.84 % en la solución.</w:t>
+        <w:t>Octave y Eigen3 entregaron resultados consistentes en los ejercicios desarrollados.</w:t>
       </w:r>
     </w:p>
     <w:p>
+      <w:pPr>
+        <w:pStyle w:val="ListBullet"/>
+      </w:pPr>
       <w:r>
-        <w:t>Los métodos directo, QR y SVD produjeron inversas coherentes, con residuos del orden de 10⁻¹¹–10⁻¹². La comparación muestra que un residuo menor en un caso particular no constituye por sí solo una prueba de estabilidad general.</w:t>
+        <w:t>Las cuatro propiedades de la pseudoinversa de Moore-Penrose se verificaron con errores cercanos a la precisión de máquina.</w:t>
       </w:r>
     </w:p>
     <w:p>
+      <w:pPr>
+        <w:pStyle w:val="ListBullet"/>
+      </w:pPr>
       <w:r>
-        <w:t>El modelo de mínimos cuadrados del convertidor DC–DC fue reproducido prácticamente de forma idéntica en Octave y Eigen3. La corriente fue la variable de mayor influencia relativa, seguida por el voltaje, mientras que la temperatura presentó una contribución menor y negativa.</w:t>
+        <w:t>Gauss, LU y QR resolvieron consistentemente el sistema 10×10 asumido, con residuos del orden de 10⁻¹⁴ a 10⁻¹⁵.</w:t>
       </w:r>
     </w:p>
     <w:p>
+      <w:pPr>
+        <w:pStyle w:val="ListBullet"/>
+      </w:pPr>
       <w:r>
-        <w:t>QR constituye una alternativa preferible a las ecuaciones normales para mínimos cuadrados por su mejor comportamiento numérico, especialmente cuando aumenta el condicionamiento del problema.</w:t>
+        <w:t>La matriz de Hilbert mostró cómo un número de condición elevado incrementa la sensibilidad de la solución frente a perturbaciones.</w:t>
       </w:r>
     </w:p>
     <w:p>
-      <w:pPr/>
+      <w:pPr>
+        <w:pStyle w:val="ListBullet"/>
+      </w:pPr>
       <w:r>
-        <w:t>Para el sistema 10×10, Gauss, LU y QR produjeron soluciones prácticamente idénticas y residuos del orden de 10⁻¹⁴–10⁻¹⁵. El número de condición κ(A) ≈ 51.715 indica un condicionamiento moderado.</w:t>
+        <w:t>En el modelo del convertidor DC-DC, la corriente fue la variable de mayor influencia relativa y QR proporcionó una formulación numéricamente recomendable para mínimos cuadrados.</w:t>
       </w:r>
     </w:p>
     <w:p>
@@ -1229,286 +832,15 @@
         <w:pStyle w:val="Heading1"/>
       </w:pPr>
       <w:r>
-        <w:t>8. Relación de entregables</w:t>
+        <w:t>8. Archivos de entrega</w:t>
       </w:r>
     </w:p>
     <w:p>
       <w:r>
-        <w:t>Para la entrega se recomienda adjuntar este informe junto con el repositorio/branch que contiene los códigos C++/Eigen3, los scripts de Octave, el archivo CMakeLists.txt y el archivo CSV de 100 muestras. Los cinco puntos quedan desarrollados; en el Punto 2 se declara explícitamente que el vector b fue asumido por los autores para completar la comparación.</w:t>
+        <w:t>La entrega se complementa con los códigos C++/Eigen3, los scripts de GNU Octave, el archivo CMakeLists.txt y el CSV de 100 muestras empleados para reproducir los resultados.</w:t>
       </w:r>
     </w:p>
-    <w:tbl>
-      <w:tblPr>
-        <w:tblStyle w:val="TableGrid"/>
-        <w:tblW w:type="auto" w:w="0"/>
-        <w:jc w:val="center"/>
-        <w:tblLook w:firstColumn="1" w:firstRow="1" w:lastColumn="0" w:lastRow="0" w:noHBand="0" w:noVBand="1" w:val="04A0"/>
-      </w:tblPr>
-      <w:tblGrid>
-        <w:gridCol w:w="3312"/>
-        <w:gridCol w:w="3312"/>
-        <w:gridCol w:w="3312"/>
-      </w:tblGrid>
-      <w:tr>
-        <w:tc>
-          <w:tcPr>
-            <w:tcW w:type="dxa" w:w="3312"/>
-          </w:tcPr>
-          <w:p>
-            <w:r>
-              <w:t>Elemento</w:t>
-            </w:r>
-          </w:p>
-        </w:tc>
-        <w:tc>
-          <w:tcPr>
-            <w:tcW w:type="dxa" w:w="3312"/>
-          </w:tcPr>
-          <w:p>
-            <w:r>
-              <w:t>Estado</w:t>
-            </w:r>
-          </w:p>
-        </w:tc>
-        <w:tc>
-          <w:tcPr>
-            <w:tcW w:type="dxa" w:w="3312"/>
-          </w:tcPr>
-          <w:p>
-            <w:r>
-              <w:t>Archivo / evidencia</w:t>
-            </w:r>
-          </w:p>
-        </w:tc>
-      </w:tr>
-      <w:tr>
-        <w:tc>
-          <w:tcPr>
-            <w:tcW w:type="dxa" w:w="3312"/>
-          </w:tcPr>
-          <w:p>
-            <w:r>
-              <w:t>Punto 1 – Moore-Penrose</w:t>
-            </w:r>
-          </w:p>
-        </w:tc>
-        <w:tc>
-          <w:tcPr>
-            <w:tcW w:type="dxa" w:w="3312"/>
-          </w:tcPr>
-          <w:p>
-            <w:r>
-              <w:t>Completo</w:t>
-            </w:r>
-          </w:p>
-        </w:tc>
-        <w:tc>
-          <w:tcPr>
-            <w:tcW w:type="dxa" w:w="3312"/>
-          </w:tcPr>
-          <w:p>
-            <w:r>
-              <w:t>main_jimmy_sebastian.cpp + resultados Octave</w:t>
-            </w:r>
-          </w:p>
-        </w:tc>
-      </w:tr>
-      <w:tr>
-        <w:tc>
-          <w:tcPr>
-            <w:tcW w:type="dxa" w:w="3312"/>
-          </w:tcPr>
-          <w:p>
-            <w:r>
-              <w:t>Punto 2 – sistema 10×10</w:t>
-            </w:r>
-          </w:p>
-        </w:tc>
-        <w:tc>
-          <w:tcPr>
-            <w:tcW w:type="dxa" w:w="3312"/>
-          </w:tcPr>
-          <w:p>
-            <w:r>
-              <w:t>Completo</w:t>
-            </w:r>
-          </w:p>
-        </w:tc>
-        <w:tc>
-          <w:tcPr>
-            <w:tcW w:type="dxa" w:w="3312"/>
-          </w:tcPr>
-          <w:p>
-            <w:r>
-              <w:t>punto2_sistema_10x10.cpp + Octave/punto2_sistema_10x10.m</w:t>
-            </w:r>
-          </w:p>
-        </w:tc>
-      </w:tr>
-      <w:tr>
-        <w:tc>
-          <w:tcPr>
-            <w:tcW w:type="dxa" w:w="3312"/>
-          </w:tcPr>
-          <w:p>
-            <w:r>
-              <w:t>Punto 3 – condicionamiento</w:t>
-            </w:r>
-          </w:p>
-        </w:tc>
-        <w:tc>
-          <w:tcPr>
-            <w:tcW w:type="dxa" w:w="3312"/>
-          </w:tcPr>
-          <w:p>
-            <w:r>
-              <w:t>Completo</w:t>
-            </w:r>
-          </w:p>
-        </w:tc>
-        <w:tc>
-          <w:tcPr>
-            <w:tcW w:type="dxa" w:w="3312"/>
-          </w:tcPr>
-          <w:p>
-            <w:r>
-              <w:t>main_jimmy_sebastian.cpp + resultados Octave</w:t>
-            </w:r>
-          </w:p>
-        </w:tc>
-      </w:tr>
-      <w:tr>
-        <w:tc>
-          <w:tcPr>
-            <w:tcW w:type="dxa" w:w="3312"/>
-          </w:tcPr>
-          <w:p>
-            <w:r>
-              <w:t>Punto 4 – inversa directa/QR/SVD</w:t>
-            </w:r>
-          </w:p>
-        </w:tc>
-        <w:tc>
-          <w:tcPr>
-            <w:tcW w:type="dxa" w:w="3312"/>
-          </w:tcPr>
-          <w:p>
-            <w:r>
-              <w:t>Completo</w:t>
-            </w:r>
-          </w:p>
-        </w:tc>
-        <w:tc>
-          <w:tcPr>
-            <w:tcW w:type="dxa" w:w="3312"/>
-          </w:tcPr>
-          <w:p>
-            <w:r>
-              <w:t>main_jimmy_sebastian.cpp + resultados Octave</w:t>
-            </w:r>
-          </w:p>
-        </w:tc>
-      </w:tr>
-      <w:tr>
-        <w:tc>
-          <w:tcPr>
-            <w:tcW w:type="dxa" w:w="3312"/>
-          </w:tcPr>
-          <w:p>
-            <w:r>
-              <w:t>Punto 5 – mínimos cuadrados</w:t>
-            </w:r>
-          </w:p>
-        </w:tc>
-        <w:tc>
-          <w:tcPr>
-            <w:tcW w:type="dxa" w:w="3312"/>
-          </w:tcPr>
-          <w:p>
-            <w:r>
-              <w:t>Completo</w:t>
-            </w:r>
-          </w:p>
-        </w:tc>
-        <w:tc>
-          <w:tcPr>
-            <w:tcW w:type="dxa" w:w="3312"/>
-          </w:tcPr>
-          <w:p>
-            <w:r>
-              <w:t>punto5_minimos_cuadrados.cpp + datos_convertidor_realista.csv + script Octave</w:t>
-            </w:r>
-          </w:p>
-        </w:tc>
-      </w:tr>
-      <w:tr>
-        <w:tc>
-          <w:tcPr>
-            <w:tcW w:type="dxa" w:w="3312"/>
-          </w:tcPr>
-          <w:p>
-            <w:r>
-              <w:t>Comparación Octave/Eigen3</w:t>
-            </w:r>
-          </w:p>
-        </w:tc>
-        <w:tc>
-          <w:tcPr>
-            <w:tcW w:type="dxa" w:w="3312"/>
-          </w:tcPr>
-          <w:p>
-            <w:r>
-              <w:t>Completo</w:t>
-            </w:r>
-          </w:p>
-        </w:tc>
-        <w:tc>
-          <w:tcPr>
-            <w:tcW w:type="dxa" w:w="3312"/>
-          </w:tcPr>
-          <w:p>
-            <w:r>
-              <w:t>Incluida en el informe</w:t>
-            </w:r>
-          </w:p>
-        </w:tc>
-      </w:tr>
-      <w:tr>
-        <w:tc>
-          <w:tcPr>
-            <w:tcW w:type="dxa" w:w="3312"/>
-          </w:tcPr>
-          <w:p>
-            <w:r>
-              <w:t>Preguntas de análisis Punto 5</w:t>
-            </w:r>
-          </w:p>
-        </w:tc>
-        <w:tc>
-          <w:tcPr>
-            <w:tcW w:type="dxa" w:w="3312"/>
-          </w:tcPr>
-          <w:p>
-            <w:r>
-              <w:t>Completo</w:t>
-            </w:r>
-          </w:p>
-        </w:tc>
-        <w:tc>
-          <w:tcPr>
-            <w:tcW w:type="dxa" w:w="3312"/>
-          </w:tcPr>
-          <w:p>
-            <w:r>
-              <w:t>Sección 5.5</w:t>
-            </w:r>
-          </w:p>
-        </w:tc>
-      </w:tr>
-    </w:tbl>
     <w:sectPr>
-      <w:headerReference w:type="default" r:id="rId9"/>
-      <w:footerReference w:type="default" r:id="rId10"/>
       <w:pgSz w:w="12240" w:h="15840"/>
       <w:pgMar w:top="1008" w:right="1152" w:bottom="1008" w:left="1152" w:header="720" w:footer="720" w:gutter="0"/>
       <w:cols w:space="720"/>
@@ -1516,41 +848,6 @@
     </w:sectPr>
   </w:body>
 </w:document>
-</file>
-
-<file path=word/footer1.xml><?xml version="1.0" encoding="utf-8"?>
-<w:ftr xmlns:m="http://schemas.openxmlformats.org/officeDocument/2006/math" xmlns:mc="http://schemas.openxmlformats.org/markup-compatibility/2006" xmlns:mo="http://schemas.microsoft.com/office/mac/office/2008/main" xmlns:mv="urn:schemas-microsoft-com:mac:vml" xmlns:o="urn:schemas-microsoft-com:office:office" xmlns:r="http://schemas.openxmlformats.org/officeDocument/2006/relationships" xmlns:v="urn:schemas-microsoft-com:vml" xmlns:w10="urn:schemas-microsoft-com:office:word" xmlns:w14="http://schemas.microsoft.com/office/word/2010/wordml" xmlns:w="http://schemas.openxmlformats.org/wordprocessingml/2006/main" xmlns:wne="http://schemas.microsoft.com/office/word/2006/wordml" xmlns:wp14="http://schemas.microsoft.com/office/word/2010/wordprocessingDrawing" xmlns:wp="http://schemas.openxmlformats.org/drawingml/2006/wordprocessingDrawing" xmlns:wpc="http://schemas.microsoft.com/office/word/2010/wordprocessingCanvas" xmlns:wpg="http://schemas.microsoft.com/office/word/2010/wordprocessingGroup" xmlns:wpi="http://schemas.microsoft.com/office/word/2010/wordprocessingInk" xmlns:wps="http://schemas.microsoft.com/office/word/2010/wordprocessingShape" mc:Ignorable="w14 wp14">
-  <w:p>
-    <w:pPr>
-      <w:pStyle w:val="Footer"/>
-      <w:jc w:val="center"/>
-    </w:pPr>
-    <w:r>
-      <w:t xml:space="preserve">Página </w:t>
-      <w:fldChar w:fldCharType="begin"/>
-      <w:instrText xml:space="preserve">PAGE</w:instrText>
-      <w:fldChar w:fldCharType="end"/>
-    </w:r>
-  </w:p>
-</w:ftr>
-</file>
-
-<file path=word/header1.xml><?xml version="1.0" encoding="utf-8"?>
-<w:hdr xmlns:m="http://schemas.openxmlformats.org/officeDocument/2006/math" xmlns:mc="http://schemas.openxmlformats.org/markup-compatibility/2006" xmlns:mo="http://schemas.microsoft.com/office/mac/office/2008/main" xmlns:mv="urn:schemas-microsoft-com:mac:vml" xmlns:o="urn:schemas-microsoft-com:office:office" xmlns:r="http://schemas.openxmlformats.org/officeDocument/2006/relationships" xmlns:v="urn:schemas-microsoft-com:vml" xmlns:w10="urn:schemas-microsoft-com:office:word" xmlns:w14="http://schemas.microsoft.com/office/word/2010/wordml" xmlns:w="http://schemas.openxmlformats.org/wordprocessingml/2006/main" xmlns:wne="http://schemas.microsoft.com/office/word/2006/wordml" xmlns:wp14="http://schemas.microsoft.com/office/word/2010/wordprocessingDrawing" xmlns:wp="http://schemas.openxmlformats.org/drawingml/2006/wordprocessingDrawing" xmlns:wpc="http://schemas.microsoft.com/office/word/2010/wordprocessingCanvas" xmlns:wpg="http://schemas.microsoft.com/office/word/2010/wordprocessingGroup" xmlns:wpi="http://schemas.microsoft.com/office/word/2010/wordprocessingInk" xmlns:wps="http://schemas.microsoft.com/office/word/2010/wordprocessingShape" mc:Ignorable="w14 wp14">
-  <w:p>
-    <w:pPr>
-      <w:pStyle w:val="Header"/>
-      <w:jc w:val="right"/>
-    </w:pPr>
-    <w:r>
-      <w:rPr>
-        <w:i/>
-        <w:sz w:val="16"/>
-      </w:rPr>
-      <w:t>Métodos Computacionales en Ingeniería – MCEI</w:t>
-    </w:r>
-  </w:p>
-</w:hdr>
 </file>
 
 <file path=word/numbering.xml><?xml version="1.0" encoding="utf-8"?>
@@ -2008,7 +1305,7 @@
       <w:b/>
       <w:bCs/>
       <w:color w:val="4F81BD" w:themeColor="accent1"/>
-      <w:sz w:val="24"/>
+      <w:sz w:val="26"/>
       <w:szCs w:val="26"/>
     </w:rPr>
   </w:style>
@@ -2028,7 +1325,7 @@
       <w:outlineLvl w:val="2"/>
     </w:pPr>
     <w:rPr>
-      <w:rFonts w:asciiTheme="majorHAnsi" w:eastAsiaTheme="majorEastAsia" w:hAnsiTheme="majorHAnsi" w:cstheme="majorBidi" w:ascii="Arial" w:hAnsi="Arial"/>
+      <w:rFonts w:asciiTheme="majorHAnsi" w:eastAsiaTheme="majorEastAsia" w:hAnsiTheme="majorHAnsi" w:cstheme="majorBidi"/>
       <w:b/>
       <w:bCs/>
       <w:color w:val="4F81BD" w:themeColor="accent1"/>
@@ -2273,7 +1570,7 @@
       <w:color w:val="17365D" w:themeColor="text2" w:themeShade="BF"/>
       <w:spacing w:val="5"/>
       <w:kern w:val="28"/>
-      <w:sz w:val="36"/>
+      <w:sz w:val="52"/>
       <w:szCs w:val="52"/>
     </w:rPr>
   </w:style>
@@ -13602,13 +12899,6 @@
         <w:shd w:val="clear" w:color="auto" w:fill="FBCAA2" w:themeFill="accent6" w:themeFillTint="7F"/>
       </w:tcPr>
     </w:tblStylePr>
-  </w:style>
-  <w:style w:type="paragraph" w:customStyle="1" w:styleId="Código">
-    <w:name w:val="Código"/>
-    <w:rPr>
-      <w:rFonts w:ascii="Consolas" w:hAnsi="Consolas"/>
-      <w:sz w:val="17"/>
-    </w:rPr>
   </w:style>
 </w:styles>
 </file>

</xml_diff>